<commit_message>
Completed first draft of MS
</commit_message>
<xml_diff>
--- a/Manuscript/Supplement.docx
+++ b/Manuscript/Supplement.docx
@@ -608,7 +608,7 @@
     </w:p>
     <w:p>
       <w:pPr>
-        <w:spacing w:line="240" w:lineRule="auto"/>
+        <w:spacing w:after="0" w:line="240" w:lineRule="auto"/>
         <w:rPr>
           <w:rFonts w:ascii="Futura Medium" w:hAnsi="Futura Medium" w:cs="Futura Medium"/>
           <w:sz w:val="20"/>
@@ -699,7 +699,23 @@
           <w:sz w:val="20"/>
           <w:szCs w:val="20"/>
         </w:rPr>
-        <w:t xml:space="preserve"> the second experiment. Lines connect </w:t>
+        <w:t xml:space="preserve"> the </w:t>
+      </w:r>
+      <w:r>
+        <w:rPr>
+          <w:rFonts w:ascii="Futura Medium" w:hAnsi="Futura Medium" w:cs="Futura Medium"/>
+          <w:sz w:val="20"/>
+          <w:szCs w:val="20"/>
+        </w:rPr>
+        <w:t>first</w:t>
+      </w:r>
+      <w:r>
+        <w:rPr>
+          <w:rFonts w:ascii="Futura Medium" w:hAnsi="Futura Medium" w:cs="Futura Medium"/>
+          <w:sz w:val="20"/>
+          <w:szCs w:val="20"/>
+        </w:rPr>
+        <w:t xml:space="preserve"> experiment. Lines connect </w:t>
       </w:r>
       <w:r>
         <w:rPr>
@@ -718,9 +734,319 @@
         <w:t>.</w:t>
       </w:r>
     </w:p>
+    <w:p>
+      <w:pPr>
+        <w:spacing w:after="0" w:line="240" w:lineRule="auto"/>
+        <w:rPr>
+          <w:rFonts w:ascii="Futura Medium" w:hAnsi="Futura Medium" w:cs="Futura Medium"/>
+          <w:sz w:val="20"/>
+          <w:szCs w:val="20"/>
+        </w:rPr>
+      </w:pPr>
+    </w:p>
+    <w:p>
+      <w:pPr>
+        <w:spacing w:after="0" w:line="240" w:lineRule="auto"/>
+        <w:rPr>
+          <w:rFonts w:ascii="Futura Medium" w:hAnsi="Futura Medium" w:cs="Futura Medium"/>
+          <w:sz w:val="20"/>
+          <w:szCs w:val="20"/>
+        </w:rPr>
+      </w:pPr>
+      <w:r>
+        <w:rPr>
+          <w:rFonts w:ascii="Futura Medium" w:hAnsi="Futura Medium" w:cs="Futura Medium"/>
+          <w:noProof/>
+          <w:sz w:val="20"/>
+          <w:szCs w:val="20"/>
+        </w:rPr>
+        <w:lastRenderedPageBreak/>
+        <w:drawing>
+          <wp:inline distT="0" distB="0" distL="0" distR="0" wp14:anchorId="1F47F266" wp14:editId="6088CB4C">
+            <wp:extent cx="5760000" cy="5190126"/>
+            <wp:effectExtent l="0" t="0" r="6350" b="4445"/>
+            <wp:docPr id="2142865059" name="Picture 1"/>
+            <wp:cNvGraphicFramePr>
+              <a:graphicFrameLocks xmlns:a="http://schemas.openxmlformats.org/drawingml/2006/main" noChangeAspect="1"/>
+            </wp:cNvGraphicFramePr>
+            <a:graphic xmlns:a="http://schemas.openxmlformats.org/drawingml/2006/main">
+              <a:graphicData uri="http://schemas.openxmlformats.org/drawingml/2006/picture">
+                <pic:pic xmlns:pic="http://schemas.openxmlformats.org/drawingml/2006/picture">
+                  <pic:nvPicPr>
+                    <pic:cNvPr id="2142865059" name="Picture 2142865059"/>
+                    <pic:cNvPicPr/>
+                  </pic:nvPicPr>
+                  <pic:blipFill>
+                    <a:blip r:embed="rId14"/>
+                    <a:stretch>
+                      <a:fillRect/>
+                    </a:stretch>
+                  </pic:blipFill>
+                  <pic:spPr>
+                    <a:xfrm>
+                      <a:off x="0" y="0"/>
+                      <a:ext cx="5760000" cy="5190126"/>
+                    </a:xfrm>
+                    <a:prstGeom prst="rect">
+                      <a:avLst/>
+                    </a:prstGeom>
+                  </pic:spPr>
+                </pic:pic>
+              </a:graphicData>
+            </a:graphic>
+          </wp:inline>
+        </w:drawing>
+      </w:r>
+    </w:p>
+    <w:p>
+      <w:pPr>
+        <w:spacing w:after="0" w:line="240" w:lineRule="auto"/>
+        <w:rPr>
+          <w:rFonts w:ascii="Futura Medium" w:hAnsi="Futura Medium" w:cs="Futura Medium"/>
+          <w:sz w:val="20"/>
+          <w:szCs w:val="20"/>
+        </w:rPr>
+      </w:pPr>
+      <w:r>
+        <w:rPr>
+          <w:rFonts w:ascii="Futura" w:hAnsi="Futura" w:cs="Futura Medium"/>
+          <w:b/>
+          <w:bCs/>
+          <w:sz w:val="20"/>
+          <w:szCs w:val="20"/>
+        </w:rPr>
+        <w:t>Figure S</w:t>
+      </w:r>
+      <w:r>
+        <w:rPr>
+          <w:rFonts w:ascii="Futura" w:hAnsi="Futura" w:cs="Futura Medium"/>
+          <w:b/>
+          <w:bCs/>
+          <w:sz w:val="20"/>
+          <w:szCs w:val="20"/>
+        </w:rPr>
+        <w:t>3</w:t>
+      </w:r>
+      <w:r>
+        <w:rPr>
+          <w:rFonts w:ascii="Futura Medium" w:hAnsi="Futura Medium" w:cs="Futura Medium" w:hint="cs"/>
+          <w:sz w:val="20"/>
+          <w:szCs w:val="20"/>
+        </w:rPr>
+        <w:t xml:space="preserve">. </w:t>
+      </w:r>
+      <w:r>
+        <w:rPr>
+          <w:rFonts w:ascii="Futura Medium" w:hAnsi="Futura Medium" w:cs="Futura Medium" w:hint="cs"/>
+          <w:sz w:val="20"/>
+          <w:szCs w:val="20"/>
+        </w:rPr>
+        <w:t xml:space="preserve">Carbonate system trajectory of </w:t>
+      </w:r>
+      <w:r>
+        <w:rPr>
+          <w:rFonts w:ascii="Futura Medium" w:hAnsi="Futura Medium" w:cs="Futura Medium"/>
+          <w:sz w:val="20"/>
+          <w:szCs w:val="20"/>
+        </w:rPr>
+        <w:t>first</w:t>
+      </w:r>
+      <w:r>
+        <w:rPr>
+          <w:rFonts w:ascii="Futura Medium" w:hAnsi="Futura Medium" w:cs="Futura Medium" w:hint="cs"/>
+          <w:sz w:val="20"/>
+          <w:szCs w:val="20"/>
+        </w:rPr>
+        <w:t xml:space="preserve"> experiment. </w:t>
+      </w:r>
+      <w:r>
+        <w:rPr>
+          <w:rFonts w:ascii="Futura Medium" w:hAnsi="Futura Medium" w:cs="Futura Medium"/>
+          <w:sz w:val="20"/>
+          <w:szCs w:val="20"/>
+        </w:rPr>
+        <w:t>Lines connect measurements for the same flask</w:t>
+      </w:r>
+      <w:r>
+        <w:rPr>
+          <w:rFonts w:ascii="Futura Medium" w:hAnsi="Futura Medium" w:cs="Futura Medium"/>
+          <w:sz w:val="20"/>
+          <w:szCs w:val="20"/>
+        </w:rPr>
+        <w:t xml:space="preserve"> through time</w:t>
+      </w:r>
+      <w:r>
+        <w:rPr>
+          <w:rFonts w:ascii="Futura Medium" w:hAnsi="Futura Medium" w:cs="Futura Medium"/>
+          <w:sz w:val="20"/>
+          <w:szCs w:val="20"/>
+        </w:rPr>
+        <w:t>.</w:t>
+      </w:r>
+      <w:r>
+        <w:rPr>
+          <w:rFonts w:ascii="Futura Medium" w:hAnsi="Futura Medium" w:cs="Futura Medium"/>
+          <w:sz w:val="20"/>
+          <w:szCs w:val="20"/>
+        </w:rPr>
+        <w:t xml:space="preserve"> </w:t>
+      </w:r>
+      <w:r>
+        <w:rPr>
+          <w:rFonts w:ascii="Futura Medium" w:hAnsi="Futura Medium" w:cs="Futura Medium" w:hint="cs"/>
+          <w:sz w:val="20"/>
+          <w:szCs w:val="20"/>
+        </w:rPr>
+        <w:t>Lines with intervals are medians and the central 50%, 80% and 90% of posterior probability for predicted observations. Distributions are kernel density estimates of posterior probability density functions for</w:t>
+      </w:r>
+      <w:r>
+        <w:rPr>
+          <w:rFonts w:ascii="Futura Medium" w:hAnsi="Futura Medium" w:cs="Futura Medium"/>
+          <w:sz w:val="20"/>
+          <w:szCs w:val="20"/>
+        </w:rPr>
+        <w:t xml:space="preserve"> the slope</w:t>
+      </w:r>
+      <w:r>
+        <w:rPr>
+          <w:rFonts w:ascii="Futura Medium" w:hAnsi="Futura Medium" w:cs="Futura Medium" w:hint="cs"/>
+          <w:sz w:val="20"/>
+          <w:szCs w:val="20"/>
+        </w:rPr>
+        <w:t xml:space="preserve"> </w:t>
+      </w:r>
+      <w:r>
+        <w:rPr>
+          <w:rFonts w:ascii="Futura Medium" w:hAnsi="Futura Medium" w:cs="Futura Medium" w:hint="cs"/>
+          <w:i/>
+          <w:iCs/>
+          <w:sz w:val="20"/>
+          <w:szCs w:val="20"/>
+        </w:rPr>
+        <w:t>q</w:t>
+      </w:r>
+      <w:r>
+        <w:rPr>
+          <w:rFonts w:ascii="Futura Medium" w:hAnsi="Futura Medium" w:cs="Futura Medium" w:hint="cs"/>
+          <w:sz w:val="20"/>
+          <w:szCs w:val="20"/>
+        </w:rPr>
+        <w:t xml:space="preserve"> (Equation 3).</w:t>
+      </w:r>
+    </w:p>
+    <w:p>
+      <w:pPr>
+        <w:spacing w:after="0" w:line="240" w:lineRule="auto"/>
+        <w:rPr>
+          <w:rFonts w:ascii="Futura Medium" w:hAnsi="Futura Medium" w:cs="Futura Medium"/>
+          <w:sz w:val="20"/>
+          <w:szCs w:val="20"/>
+        </w:rPr>
+      </w:pPr>
+      <w:r>
+        <w:rPr>
+          <w:rFonts w:ascii="Futura Medium" w:hAnsi="Futura Medium" w:cs="Futura Medium"/>
+          <w:noProof/>
+          <w:sz w:val="20"/>
+          <w:szCs w:val="20"/>
+        </w:rPr>
+        <w:lastRenderedPageBreak/>
+        <w:drawing>
+          <wp:inline distT="0" distB="0" distL="0" distR="0" wp14:anchorId="2F84F9A1" wp14:editId="322C29A0">
+            <wp:extent cx="5760000" cy="3663656"/>
+            <wp:effectExtent l="0" t="0" r="6350" b="0"/>
+            <wp:docPr id="147440751" name="Picture 2"/>
+            <wp:cNvGraphicFramePr>
+              <a:graphicFrameLocks xmlns:a="http://schemas.openxmlformats.org/drawingml/2006/main" noChangeAspect="1"/>
+            </wp:cNvGraphicFramePr>
+            <a:graphic xmlns:a="http://schemas.openxmlformats.org/drawingml/2006/main">
+              <a:graphicData uri="http://schemas.openxmlformats.org/drawingml/2006/picture">
+                <pic:pic xmlns:pic="http://schemas.openxmlformats.org/drawingml/2006/picture">
+                  <pic:nvPicPr>
+                    <pic:cNvPr id="147440751" name="Picture 147440751"/>
+                    <pic:cNvPicPr/>
+                  </pic:nvPicPr>
+                  <pic:blipFill>
+                    <a:blip r:embed="rId15"/>
+                    <a:stretch>
+                      <a:fillRect/>
+                    </a:stretch>
+                  </pic:blipFill>
+                  <pic:spPr>
+                    <a:xfrm>
+                      <a:off x="0" y="0"/>
+                      <a:ext cx="5760000" cy="3663656"/>
+                    </a:xfrm>
+                    <a:prstGeom prst="rect">
+                      <a:avLst/>
+                    </a:prstGeom>
+                  </pic:spPr>
+                </pic:pic>
+              </a:graphicData>
+            </a:graphic>
+          </wp:inline>
+        </w:drawing>
+      </w:r>
+    </w:p>
+    <w:p>
+      <w:pPr>
+        <w:spacing w:after="0" w:line="240" w:lineRule="auto"/>
+        <w:rPr>
+          <w:rFonts w:ascii="Futura Medium" w:hAnsi="Futura Medium" w:cs="Futura Medium"/>
+          <w:sz w:val="20"/>
+          <w:szCs w:val="20"/>
+        </w:rPr>
+      </w:pPr>
+      <w:r>
+        <w:rPr>
+          <w:rFonts w:ascii="Futura" w:hAnsi="Futura" w:cs="Futura Medium"/>
+          <w:b/>
+          <w:bCs/>
+          <w:sz w:val="20"/>
+          <w:szCs w:val="20"/>
+        </w:rPr>
+        <w:t>Figure S</w:t>
+      </w:r>
+      <w:r>
+        <w:rPr>
+          <w:rFonts w:ascii="Futura" w:hAnsi="Futura" w:cs="Futura Medium"/>
+          <w:b/>
+          <w:bCs/>
+          <w:sz w:val="20"/>
+          <w:szCs w:val="20"/>
+        </w:rPr>
+        <w:t>4</w:t>
+      </w:r>
+      <w:r>
+        <w:rPr>
+          <w:rFonts w:ascii="Futura Medium" w:hAnsi="Futura Medium" w:cs="Futura Medium" w:hint="cs"/>
+          <w:sz w:val="20"/>
+          <w:szCs w:val="20"/>
+        </w:rPr>
+        <w:t xml:space="preserve">. </w:t>
+      </w:r>
+      <w:r>
+        <w:rPr>
+          <w:rFonts w:ascii="Futura Medium" w:hAnsi="Futura Medium" w:cs="Futura Medium"/>
+          <w:sz w:val="20"/>
+          <w:szCs w:val="20"/>
+        </w:rPr>
+        <w:t>pH, nitrogen oxides and phosphate over the duration of the second experiment. Lines connect measurements for the same flask.</w:t>
+      </w:r>
+    </w:p>
+    <w:p>
+      <w:pPr>
+        <w:spacing w:after="0" w:line="240" w:lineRule="auto"/>
+        <w:rPr>
+          <w:rFonts w:ascii="Futura Medium" w:hAnsi="Futura Medium" w:cs="Futura Medium"/>
+          <w:sz w:val="20"/>
+          <w:szCs w:val="20"/>
+        </w:rPr>
+      </w:pPr>
+    </w:p>
     <w:sectPr>
-      <w:footerReference w:type="even" r:id="rId14"/>
-      <w:footerReference w:type="default" r:id="rId15"/>
+      <w:footerReference w:type="even" r:id="rId16"/>
+      <w:footerReference w:type="default" r:id="rId17"/>
       <w:pgSz w:w="11906" w:h="16838"/>
       <w:pgMar w:top="1440" w:right="1440" w:bottom="1440" w:left="1440" w:header="708" w:footer="708" w:gutter="0"/>
       <w:cols w:space="708"/>

</xml_diff>